<commit_message>
Generalize templates and expose cross-references
</commit_message>
<xml_diff>
--- a/assets/NF-SWIPT_中文学术技术报告模板.docx
+++ b/assets/NF-SWIPT_中文学术技术报告模板.docx
@@ -238,12 +238,11 @@
       <w:pPr>
         <w:pStyle w:val="1"/>
       </w:pPr>
-      <w:bookmarkStart w:id="0" w:name="_Toc235285766"/>
+      <w:bookmarkStart w:id="0" w:name="_Toc235289364"/>
       <w:r>
         <w:rPr>
           <w:rFonts w:ascii="Times New Roman" w:eastAsia="黑体" w:hAnsi="Times New Roman" w:cs="Times New Roman"/>
         </w:rPr>
-        <w:lastRenderedPageBreak/>
         <w:t>摘</w:t>
       </w:r>
       <w:r>
@@ -280,7 +279,7 @@
       <w:pPr>
         <w:pStyle w:val="1"/>
       </w:pPr>
-      <w:bookmarkStart w:id="1" w:name="_Toc235285767"/>
+      <w:bookmarkStart w:id="1" w:name="_Toc235289365"/>
       <w:r>
         <w:rPr>
           <w:rFonts w:ascii="Times New Roman" w:eastAsia="黑体" w:hAnsi="Times New Roman" w:cs="Times New Roman"/>
@@ -310,12 +309,11 @@
         <w:pStyle w:val="1"/>
         <w:pageBreakBefore/>
       </w:pPr>
-      <w:bookmarkStart w:id="2" w:name="_Toc235285768"/>
+      <w:bookmarkStart w:id="2" w:name="_Toc235289366"/>
       <w:r>
         <w:rPr>
           <w:rFonts w:ascii="Times New Roman" w:eastAsia="黑体" w:hAnsi="Times New Roman" w:cs="Times New Roman"/>
         </w:rPr>
-        <w:lastRenderedPageBreak/>
         <w:t>目</w:t>
       </w:r>
       <w:r>
@@ -358,7 +356,7 @@
       <w:r>
         <w:fldChar w:fldCharType="separate"/>
       </w:r>
-      <w:hyperlink w:anchor="_Toc235285766" w:history="1">
+      <w:hyperlink w:anchor="_Toc235289364" w:history="1">
         <w:r>
           <w:rPr>
             <w:rStyle w:val="afff"/>
@@ -402,7 +400,7 @@
             <w:noProof/>
             <w:webHidden/>
           </w:rPr>
-          <w:instrText xml:space="preserve"> PAGEREF _Toc235285766 \h </w:instrText>
+          <w:instrText xml:space="preserve"> PAGEREF _Toc235289364 \h </w:instrText>
         </w:r>
         <w:r>
           <w:rPr>
@@ -450,7 +448,7 @@
           <w14:ligatures w14:val="standardContextual"/>
         </w:rPr>
       </w:pPr>
-      <w:hyperlink w:anchor="_Toc235285767" w:history="1">
+      <w:hyperlink w:anchor="_Toc235289365" w:history="1">
         <w:r>
           <w:rPr>
             <w:rStyle w:val="afff"/>
@@ -478,7 +476,7 @@
             <w:noProof/>
             <w:webHidden/>
           </w:rPr>
-          <w:instrText xml:space="preserve"> PAGEREF _Toc235285767 \h </w:instrText>
+          <w:instrText xml:space="preserve"> PAGEREF _Toc235289365 \h </w:instrText>
         </w:r>
         <w:r>
           <w:rPr>
@@ -526,7 +524,7 @@
           <w14:ligatures w14:val="standardContextual"/>
         </w:rPr>
       </w:pPr>
-      <w:hyperlink w:anchor="_Toc235285768" w:history="1">
+      <w:hyperlink w:anchor="_Toc235289366" w:history="1">
         <w:r>
           <w:rPr>
             <w:rStyle w:val="afff"/>
@@ -570,7 +568,7 @@
             <w:noProof/>
             <w:webHidden/>
           </w:rPr>
-          <w:instrText xml:space="preserve"> PAGEREF _Toc235285768 \h </w:instrText>
+          <w:instrText xml:space="preserve"> PAGEREF _Toc235289366 \h </w:instrText>
         </w:r>
         <w:r>
           <w:rPr>
@@ -618,7 +616,7 @@
           <w14:ligatures w14:val="standardContextual"/>
         </w:rPr>
       </w:pPr>
-      <w:hyperlink w:anchor="_Toc235285769" w:history="1">
+      <w:hyperlink w:anchor="_Toc235289367" w:history="1">
         <w:r>
           <w:rPr>
             <w:rStyle w:val="afff"/>
@@ -654,7 +652,7 @@
             <w:noProof/>
             <w:webHidden/>
           </w:rPr>
-          <w:instrText xml:space="preserve"> PAGEREF _Toc235285769 \h </w:instrText>
+          <w:instrText xml:space="preserve"> PAGEREF _Toc235289367 \h </w:instrText>
         </w:r>
         <w:r>
           <w:rPr>
@@ -703,7 +701,7 @@
           <w14:ligatures w14:val="standardContextual"/>
         </w:rPr>
       </w:pPr>
-      <w:hyperlink w:anchor="_Toc235285770" w:history="1">
+      <w:hyperlink w:anchor="_Toc235289368" w:history="1">
         <w:r>
           <w:rPr>
             <w:rStyle w:val="afff"/>
@@ -739,7 +737,7 @@
             <w:noProof/>
             <w:webHidden/>
           </w:rPr>
-          <w:instrText xml:space="preserve"> PAGEREF _Toc235285770 \h </w:instrText>
+          <w:instrText xml:space="preserve"> PAGEREF _Toc235289368 \h </w:instrText>
         </w:r>
         <w:r>
           <w:rPr>
@@ -788,7 +786,7 @@
           <w14:ligatures w14:val="standardContextual"/>
         </w:rPr>
       </w:pPr>
-      <w:hyperlink w:anchor="_Toc235285771" w:history="1">
+      <w:hyperlink w:anchor="_Toc235289369" w:history="1">
         <w:r>
           <w:rPr>
             <w:rStyle w:val="afff"/>
@@ -824,7 +822,7 @@
             <w:noProof/>
             <w:webHidden/>
           </w:rPr>
-          <w:instrText xml:space="preserve"> PAGEREF _Toc235285771 \h </w:instrText>
+          <w:instrText xml:space="preserve"> PAGEREF _Toc235289369 \h </w:instrText>
         </w:r>
         <w:r>
           <w:rPr>
@@ -872,7 +870,7 @@
           <w14:ligatures w14:val="standardContextual"/>
         </w:rPr>
       </w:pPr>
-      <w:hyperlink w:anchor="_Toc235285772" w:history="1">
+      <w:hyperlink w:anchor="_Toc235289370" w:history="1">
         <w:r>
           <w:rPr>
             <w:rStyle w:val="afff"/>
@@ -908,7 +906,7 @@
             <w:noProof/>
             <w:webHidden/>
           </w:rPr>
-          <w:instrText xml:space="preserve"> PAGEREF _Toc235285772 \h </w:instrText>
+          <w:instrText xml:space="preserve"> PAGEREF _Toc235289370 \h </w:instrText>
         </w:r>
         <w:r>
           <w:rPr>
@@ -957,7 +955,7 @@
           <w14:ligatures w14:val="standardContextual"/>
         </w:rPr>
       </w:pPr>
-      <w:hyperlink w:anchor="_Toc235285773" w:history="1">
+      <w:hyperlink w:anchor="_Toc235289371" w:history="1">
         <w:r>
           <w:rPr>
             <w:rStyle w:val="afff"/>
@@ -993,7 +991,7 @@
             <w:noProof/>
             <w:webHidden/>
           </w:rPr>
-          <w:instrText xml:space="preserve"> PAGEREF _Toc235285773 \h </w:instrText>
+          <w:instrText xml:space="preserve"> PAGEREF _Toc235289371 \h </w:instrText>
         </w:r>
         <w:r>
           <w:rPr>
@@ -1042,7 +1040,7 @@
           <w14:ligatures w14:val="standardContextual"/>
         </w:rPr>
       </w:pPr>
-      <w:hyperlink w:anchor="_Toc235285774" w:history="1">
+      <w:hyperlink w:anchor="_Toc235289372" w:history="1">
         <w:r>
           <w:rPr>
             <w:rStyle w:val="afff"/>
@@ -1078,7 +1076,7 @@
             <w:noProof/>
             <w:webHidden/>
           </w:rPr>
-          <w:instrText xml:space="preserve"> PAGEREF _Toc235285774 \h </w:instrText>
+          <w:instrText xml:space="preserve"> PAGEREF _Toc235289372 \h </w:instrText>
         </w:r>
         <w:r>
           <w:rPr>
@@ -1127,7 +1125,7 @@
           <w14:ligatures w14:val="standardContextual"/>
         </w:rPr>
       </w:pPr>
-      <w:hyperlink w:anchor="_Toc235285775" w:history="1">
+      <w:hyperlink w:anchor="_Toc235289373" w:history="1">
         <w:r>
           <w:rPr>
             <w:rStyle w:val="afff"/>
@@ -1163,7 +1161,7 @@
             <w:noProof/>
             <w:webHidden/>
           </w:rPr>
-          <w:instrText xml:space="preserve"> PAGEREF _Toc235285775 \h </w:instrText>
+          <w:instrText xml:space="preserve"> PAGEREF _Toc235289373 \h </w:instrText>
         </w:r>
         <w:r>
           <w:rPr>
@@ -1211,7 +1209,7 @@
           <w14:ligatures w14:val="standardContextual"/>
         </w:rPr>
       </w:pPr>
-      <w:hyperlink w:anchor="_Toc235285776" w:history="1">
+      <w:hyperlink w:anchor="_Toc235289374" w:history="1">
         <w:r>
           <w:rPr>
             <w:rStyle w:val="afff"/>
@@ -1247,7 +1245,7 @@
             <w:noProof/>
             <w:webHidden/>
           </w:rPr>
-          <w:instrText xml:space="preserve"> PAGEREF _Toc235285776 \h </w:instrText>
+          <w:instrText xml:space="preserve"> PAGEREF _Toc235289374 \h </w:instrText>
         </w:r>
         <w:r>
           <w:rPr>
@@ -1296,7 +1294,7 @@
           <w14:ligatures w14:val="standardContextual"/>
         </w:rPr>
       </w:pPr>
-      <w:hyperlink w:anchor="_Toc235285777" w:history="1">
+      <w:hyperlink w:anchor="_Toc235289375" w:history="1">
         <w:r>
           <w:rPr>
             <w:rStyle w:val="afff"/>
@@ -1332,7 +1330,7 @@
             <w:noProof/>
             <w:webHidden/>
           </w:rPr>
-          <w:instrText xml:space="preserve"> PAGEREF _Toc235285777 \h </w:instrText>
+          <w:instrText xml:space="preserve"> PAGEREF _Toc235289375 \h </w:instrText>
         </w:r>
         <w:r>
           <w:rPr>
@@ -1381,7 +1379,7 @@
           <w14:ligatures w14:val="standardContextual"/>
         </w:rPr>
       </w:pPr>
-      <w:hyperlink w:anchor="_Toc235285778" w:history="1">
+      <w:hyperlink w:anchor="_Toc235289376" w:history="1">
         <w:r>
           <w:rPr>
             <w:rStyle w:val="afff"/>
@@ -1417,7 +1415,7 @@
             <w:noProof/>
             <w:webHidden/>
           </w:rPr>
-          <w:instrText xml:space="preserve"> PAGEREF _Toc235285778 \h </w:instrText>
+          <w:instrText xml:space="preserve"> PAGEREF _Toc235289376 \h </w:instrText>
         </w:r>
         <w:r>
           <w:rPr>
@@ -1465,7 +1463,7 @@
           <w14:ligatures w14:val="standardContextual"/>
         </w:rPr>
       </w:pPr>
-      <w:hyperlink w:anchor="_Toc235285779" w:history="1">
+      <w:hyperlink w:anchor="_Toc235289377" w:history="1">
         <w:r>
           <w:rPr>
             <w:rStyle w:val="afff"/>
@@ -1501,7 +1499,7 @@
             <w:noProof/>
             <w:webHidden/>
           </w:rPr>
-          <w:instrText xml:space="preserve"> PAGEREF _Toc235285779 \h </w:instrText>
+          <w:instrText xml:space="preserve"> PAGEREF _Toc235289377 \h </w:instrText>
         </w:r>
         <w:r>
           <w:rPr>
@@ -1550,7 +1548,7 @@
           <w14:ligatures w14:val="standardContextual"/>
         </w:rPr>
       </w:pPr>
-      <w:hyperlink w:anchor="_Toc235285780" w:history="1">
+      <w:hyperlink w:anchor="_Toc235289378" w:history="1">
         <w:r>
           <w:rPr>
             <w:rStyle w:val="afff"/>
@@ -1586,7 +1584,7 @@
             <w:noProof/>
             <w:webHidden/>
           </w:rPr>
-          <w:instrText xml:space="preserve"> PAGEREF _Toc235285780 \h </w:instrText>
+          <w:instrText xml:space="preserve"> PAGEREF _Toc235289378 \h </w:instrText>
         </w:r>
         <w:r>
           <w:rPr>
@@ -1635,7 +1633,7 @@
           <w14:ligatures w14:val="standardContextual"/>
         </w:rPr>
       </w:pPr>
-      <w:hyperlink w:anchor="_Toc235285781" w:history="1">
+      <w:hyperlink w:anchor="_Toc235289379" w:history="1">
         <w:r>
           <w:rPr>
             <w:rStyle w:val="afff"/>
@@ -1671,7 +1669,7 @@
             <w:noProof/>
             <w:webHidden/>
           </w:rPr>
-          <w:instrText xml:space="preserve"> PAGEREF _Toc235285781 \h </w:instrText>
+          <w:instrText xml:space="preserve"> PAGEREF _Toc235289379 \h </w:instrText>
         </w:r>
         <w:r>
           <w:rPr>
@@ -1720,7 +1718,7 @@
           <w14:ligatures w14:val="standardContextual"/>
         </w:rPr>
       </w:pPr>
-      <w:hyperlink w:anchor="_Toc235285782" w:history="1">
+      <w:hyperlink w:anchor="_Toc235289380" w:history="1">
         <w:r>
           <w:rPr>
             <w:rStyle w:val="afff"/>
@@ -1756,7 +1754,7 @@
             <w:noProof/>
             <w:webHidden/>
           </w:rPr>
-          <w:instrText xml:space="preserve"> PAGEREF _Toc235285782 \h </w:instrText>
+          <w:instrText xml:space="preserve"> PAGEREF _Toc235289380 \h </w:instrText>
         </w:r>
         <w:r>
           <w:rPr>
@@ -1805,7 +1803,7 @@
           <w14:ligatures w14:val="standardContextual"/>
         </w:rPr>
       </w:pPr>
-      <w:hyperlink w:anchor="_Toc235285783" w:history="1">
+      <w:hyperlink w:anchor="_Toc235289381" w:history="1">
         <w:r>
           <w:rPr>
             <w:rStyle w:val="afff"/>
@@ -1873,7 +1871,7 @@
             <w:noProof/>
             <w:webHidden/>
           </w:rPr>
-          <w:instrText xml:space="preserve"> PAGEREF _Toc235285783 \h </w:instrText>
+          <w:instrText xml:space="preserve"> PAGEREF _Toc235289381 \h </w:instrText>
         </w:r>
         <w:r>
           <w:rPr>
@@ -1922,7 +1920,7 @@
           <w14:ligatures w14:val="standardContextual"/>
         </w:rPr>
       </w:pPr>
-      <w:hyperlink w:anchor="_Toc235285784" w:history="1">
+      <w:hyperlink w:anchor="_Toc235289382" w:history="1">
         <w:r>
           <w:rPr>
             <w:rStyle w:val="afff"/>
@@ -1958,7 +1956,7 @@
             <w:noProof/>
             <w:webHidden/>
           </w:rPr>
-          <w:instrText xml:space="preserve"> PAGEREF _Toc235285784 \h </w:instrText>
+          <w:instrText xml:space="preserve"> PAGEREF _Toc235289382 \h </w:instrText>
         </w:r>
         <w:r>
           <w:rPr>
@@ -2006,7 +2004,7 @@
           <w14:ligatures w14:val="standardContextual"/>
         </w:rPr>
       </w:pPr>
-      <w:hyperlink w:anchor="_Toc235285785" w:history="1">
+      <w:hyperlink w:anchor="_Toc235289383" w:history="1">
         <w:r>
           <w:rPr>
             <w:rStyle w:val="afff"/>
@@ -2042,7 +2040,7 @@
             <w:noProof/>
             <w:webHidden/>
           </w:rPr>
-          <w:instrText xml:space="preserve"> PAGEREF _Toc235285785 \h </w:instrText>
+          <w:instrText xml:space="preserve"> PAGEREF _Toc235289383 \h </w:instrText>
         </w:r>
         <w:r>
           <w:rPr>
@@ -2090,7 +2088,7 @@
           <w14:ligatures w14:val="standardContextual"/>
         </w:rPr>
       </w:pPr>
-      <w:hyperlink w:anchor="_Toc235285786" w:history="1">
+      <w:hyperlink w:anchor="_Toc235289384" w:history="1">
         <w:r>
           <w:rPr>
             <w:rStyle w:val="afff"/>
@@ -2118,7 +2116,7 @@
             <w:noProof/>
             <w:webHidden/>
           </w:rPr>
-          <w:instrText xml:space="preserve"> PAGEREF _Toc235285786 \h </w:instrText>
+          <w:instrText xml:space="preserve"> PAGEREF _Toc235289384 \h </w:instrText>
         </w:r>
         <w:r>
           <w:rPr>
@@ -2166,7 +2164,7 @@
           <w14:ligatures w14:val="standardContextual"/>
         </w:rPr>
       </w:pPr>
-      <w:hyperlink w:anchor="_Toc235285787" w:history="1">
+      <w:hyperlink w:anchor="_Toc235289385" w:history="1">
         <w:r>
           <w:rPr>
             <w:rStyle w:val="afff"/>
@@ -2189,7 +2187,7 @@
             <w:rFonts w:eastAsia="黑体"/>
             <w:noProof/>
           </w:rPr>
-          <w:t>统一排版规则</w:t>
+          <w:t>交叉引用查看与更新</w:t>
         </w:r>
         <w:r>
           <w:rPr>
@@ -2210,7 +2208,7 @@
             <w:noProof/>
             <w:webHidden/>
           </w:rPr>
-          <w:instrText xml:space="preserve"> PAGEREF _Toc235285787 \h </w:instrText>
+          <w:instrText xml:space="preserve"> PAGEREF _Toc235289385 \h </w:instrText>
         </w:r>
         <w:r>
           <w:rPr>
@@ -2258,7 +2256,7 @@
           <w14:ligatures w14:val="standardContextual"/>
         </w:rPr>
       </w:pPr>
-      <w:hyperlink w:anchor="_Toc235285788" w:history="1">
+      <w:hyperlink w:anchor="_Toc235289386" w:history="1">
         <w:r>
           <w:rPr>
             <w:rStyle w:val="afff"/>
@@ -2281,7 +2279,7 @@
             <w:rFonts w:eastAsia="黑体"/>
             <w:noProof/>
           </w:rPr>
-          <w:t>规范依据</w:t>
+          <w:t>统一排版规则</w:t>
         </w:r>
         <w:r>
           <w:rPr>
@@ -2302,7 +2300,7 @@
             <w:noProof/>
             <w:webHidden/>
           </w:rPr>
-          <w:instrText xml:space="preserve"> PAGEREF _Toc235285788 \h </w:instrText>
+          <w:instrText xml:space="preserve"> PAGEREF _Toc235289386 \h </w:instrText>
         </w:r>
         <w:r>
           <w:rPr>
@@ -2335,23 +2333,114 @@
     </w:p>
     <w:p>
       <w:pPr>
-        <w:ind w:firstLine="0"/>
-      </w:pPr>
-      <w:r>
-        <w:fldChar w:fldCharType="end"/>
-      </w:r>
+        <w:pStyle w:val="TOC1"/>
+        <w:tabs>
+          <w:tab w:val="right" w:leader="dot" w:pos="9514"/>
+        </w:tabs>
+        <w:rPr>
+          <w:rFonts w:asciiTheme="minorHAnsi" w:eastAsiaTheme="minorEastAsia" w:hAnsiTheme="minorHAnsi" w:cstheme="minorBidi"/>
+          <w:noProof/>
+          <w:color w:val="auto"/>
+          <w:kern w:val="2"/>
+          <w:sz w:val="22"/>
+          <w:szCs w:val="24"/>
+          <w:lang w:eastAsia="zh-CN"/>
+          <w14:ligatures w14:val="standardContextual"/>
+        </w:rPr>
+      </w:pPr>
+      <w:hyperlink w:anchor="_Toc235289387" w:history="1">
+        <w:r>
+          <w:rPr>
+            <w:rStyle w:val="afff"/>
+            <w:rFonts w:eastAsia="黑体"/>
+            <w:noProof/>
+          </w:rPr>
+          <w:t>附录</w:t>
+        </w:r>
+        <w:r>
+          <w:rPr>
+            <w:rStyle w:val="afff"/>
+            <w:rFonts w:eastAsia="黑体"/>
+            <w:noProof/>
+          </w:rPr>
+          <w:t xml:space="preserve">C </w:t>
+        </w:r>
+        <w:r>
+          <w:rPr>
+            <w:rStyle w:val="afff"/>
+            <w:rFonts w:eastAsia="黑体"/>
+            <w:noProof/>
+          </w:rPr>
+          <w:t>规范依据</w:t>
+        </w:r>
+        <w:r>
+          <w:rPr>
+            <w:noProof/>
+            <w:webHidden/>
+          </w:rPr>
+          <w:tab/>
+        </w:r>
+        <w:r>
+          <w:rPr>
+            <w:noProof/>
+            <w:webHidden/>
+          </w:rPr>
+          <w:fldChar w:fldCharType="begin"/>
+        </w:r>
+        <w:r>
+          <w:rPr>
+            <w:noProof/>
+            <w:webHidden/>
+          </w:rPr>
+          <w:instrText xml:space="preserve"> PAGEREF _Toc235289387 \h </w:instrText>
+        </w:r>
+        <w:r>
+          <w:rPr>
+            <w:noProof/>
+            <w:webHidden/>
+          </w:rPr>
+        </w:r>
+        <w:r>
+          <w:rPr>
+            <w:noProof/>
+            <w:webHidden/>
+          </w:rPr>
+          <w:fldChar w:fldCharType="separate"/>
+        </w:r>
+        <w:r>
+          <w:rPr>
+            <w:noProof/>
+            <w:webHidden/>
+          </w:rPr>
+          <w:t>14</w:t>
+        </w:r>
+        <w:r>
+          <w:rPr>
+            <w:noProof/>
+            <w:webHidden/>
+          </w:rPr>
+          <w:fldChar w:fldCharType="end"/>
+        </w:r>
+      </w:hyperlink>
     </w:p>
     <w:p>
       <w:pPr>
+        <w:ind w:firstLine="0"/>
+      </w:pPr>
+      <w:r>
+        <w:fldChar w:fldCharType="end"/>
+      </w:r>
+    </w:p>
+    <w:p>
+      <w:pPr>
         <w:pStyle w:val="1"/>
         <w:pageBreakBefore/>
       </w:pPr>
-      <w:bookmarkStart w:id="3" w:name="_Toc235285769"/>
+      <w:bookmarkStart w:id="3" w:name="_Toc235289367"/>
       <w:r>
         <w:rPr>
           <w:rFonts w:ascii="Times New Roman" w:eastAsia="黑体" w:hAnsi="Times New Roman" w:cs="Times New Roman"/>
         </w:rPr>
-        <w:lastRenderedPageBreak/>
         <w:t xml:space="preserve">1 </w:t>
       </w:r>
       <w:r>
@@ -2366,7 +2455,7 @@
       <w:pPr>
         <w:pStyle w:val="21"/>
       </w:pPr>
-      <w:bookmarkStart w:id="4" w:name="_Toc235285770"/>
+      <w:bookmarkStart w:id="4" w:name="_Toc235289368"/>
       <w:r>
         <w:rPr>
           <w:rFonts w:ascii="Times New Roman" w:eastAsia="黑体" w:hAnsi="Times New Roman" w:cs="Times New Roman"/>
@@ -2434,7 +2523,7 @@
       <w:pPr>
         <w:pStyle w:val="21"/>
       </w:pPr>
-      <w:bookmarkStart w:id="5" w:name="_Toc235285771"/>
+      <w:bookmarkStart w:id="5" w:name="_Toc235289369"/>
       <w:r>
         <w:rPr>
           <w:rFonts w:ascii="Times New Roman" w:eastAsia="黑体" w:hAnsi="Times New Roman" w:cs="Times New Roman"/>
@@ -2580,12 +2669,11 @@
         <w:pStyle w:val="1"/>
         <w:pageBreakBefore/>
       </w:pPr>
-      <w:bookmarkStart w:id="6" w:name="_Toc235285772"/>
+      <w:bookmarkStart w:id="6" w:name="_Toc235289370"/>
       <w:r>
         <w:rPr>
           <w:rFonts w:ascii="Times New Roman" w:eastAsia="黑体" w:hAnsi="Times New Roman" w:cs="Times New Roman"/>
         </w:rPr>
-        <w:lastRenderedPageBreak/>
         <w:t>2 NF-SWIPT</w:t>
       </w:r>
       <w:r>
@@ -2600,7 +2688,7 @@
       <w:pPr>
         <w:pStyle w:val="21"/>
       </w:pPr>
-      <w:bookmarkStart w:id="7" w:name="_Toc235285773"/>
+      <w:bookmarkStart w:id="7" w:name="_Toc235289371"/>
       <w:r>
         <w:rPr>
           <w:rFonts w:ascii="Times New Roman" w:eastAsia="黑体" w:hAnsi="Times New Roman" w:cs="Times New Roman"/>
@@ -2898,7 +2986,7 @@
       <w:pPr>
         <w:pStyle w:val="21"/>
       </w:pPr>
-      <w:bookmarkStart w:id="9" w:name="_Toc235285774"/>
+      <w:bookmarkStart w:id="9" w:name="_Toc235289372"/>
       <w:r>
         <w:rPr>
           <w:rFonts w:ascii="Times New Roman" w:eastAsia="黑体" w:hAnsi="Times New Roman" w:cs="Times New Roman"/>
@@ -2995,7 +3083,7 @@
       <w:pPr>
         <w:pStyle w:val="21"/>
       </w:pPr>
-      <w:bookmarkStart w:id="11" w:name="_Toc235285775"/>
+      <w:bookmarkStart w:id="11" w:name="_Toc235289373"/>
       <w:r>
         <w:rPr>
           <w:rFonts w:ascii="Times New Roman" w:eastAsia="黑体" w:hAnsi="Times New Roman" w:cs="Times New Roman"/>
@@ -3219,12 +3307,11 @@
         <w:pStyle w:val="1"/>
         <w:pageBreakBefore/>
       </w:pPr>
-      <w:bookmarkStart w:id="14" w:name="_Toc235285776"/>
+      <w:bookmarkStart w:id="14" w:name="_Toc235289374"/>
       <w:r>
         <w:rPr>
           <w:rFonts w:ascii="Times New Roman" w:eastAsia="黑体" w:hAnsi="Times New Roman" w:cs="Times New Roman"/>
         </w:rPr>
-        <w:lastRenderedPageBreak/>
         <w:t xml:space="preserve">3 </w:t>
       </w:r>
       <w:r>
@@ -3239,7 +3326,7 @@
       <w:pPr>
         <w:pStyle w:val="21"/>
       </w:pPr>
-      <w:bookmarkStart w:id="15" w:name="_Toc235285777"/>
+      <w:bookmarkStart w:id="15" w:name="_Toc235289375"/>
       <w:r>
         <w:rPr>
           <w:rFonts w:ascii="Times New Roman" w:eastAsia="黑体" w:hAnsi="Times New Roman" w:cs="Times New Roman"/>
@@ -3361,7 +3448,7 @@
       <w:pPr>
         <w:pStyle w:val="21"/>
       </w:pPr>
-      <w:bookmarkStart w:id="18" w:name="_Toc235285778"/>
+      <w:bookmarkStart w:id="18" w:name="_Toc235289376"/>
       <w:r>
         <w:rPr>
           <w:rFonts w:ascii="Times New Roman" w:eastAsia="黑体" w:hAnsi="Times New Roman" w:cs="Times New Roman"/>
@@ -3404,12 +3491,11 @@
         <w:pStyle w:val="1"/>
         <w:pageBreakBefore/>
       </w:pPr>
-      <w:bookmarkStart w:id="19" w:name="_Toc235285779"/>
+      <w:bookmarkStart w:id="19" w:name="_Toc235289377"/>
       <w:r>
         <w:rPr>
           <w:rFonts w:ascii="Times New Roman" w:eastAsia="黑体" w:hAnsi="Times New Roman" w:cs="Times New Roman"/>
         </w:rPr>
-        <w:lastRenderedPageBreak/>
         <w:t xml:space="preserve">4 </w:t>
       </w:r>
       <w:r>
@@ -3424,7 +3510,7 @@
       <w:pPr>
         <w:pStyle w:val="21"/>
       </w:pPr>
-      <w:bookmarkStart w:id="20" w:name="_Toc235285780"/>
+      <w:bookmarkStart w:id="20" w:name="_Toc235289378"/>
       <w:r>
         <w:rPr>
           <w:rFonts w:ascii="Times New Roman" w:eastAsia="黑体" w:hAnsi="Times New Roman" w:cs="Times New Roman"/>
@@ -4319,7 +4405,7 @@
       <w:pPr>
         <w:pStyle w:val="21"/>
       </w:pPr>
-      <w:bookmarkStart w:id="22" w:name="_Toc235285781"/>
+      <w:bookmarkStart w:id="22" w:name="_Toc235289379"/>
       <w:r>
         <w:rPr>
           <w:rFonts w:ascii="Times New Roman" w:eastAsia="黑体" w:hAnsi="Times New Roman" w:cs="Times New Roman"/>
@@ -4596,12 +4682,11 @@
       <w:pPr>
         <w:pStyle w:val="21"/>
       </w:pPr>
-      <w:bookmarkStart w:id="24" w:name="_Toc235285782"/>
+      <w:bookmarkStart w:id="24" w:name="_Toc235289380"/>
       <w:r>
         <w:rPr>
           <w:rFonts w:ascii="Times New Roman" w:eastAsia="黑体" w:hAnsi="Times New Roman" w:cs="Times New Roman"/>
         </w:rPr>
-        <w:lastRenderedPageBreak/>
         <w:t xml:space="preserve">4.3 </w:t>
       </w:r>
       <w:r>
@@ -4868,7 +4953,7 @@
       <w:pPr>
         <w:pStyle w:val="21"/>
       </w:pPr>
-      <w:bookmarkStart w:id="26" w:name="_Toc235285783"/>
+      <w:bookmarkStart w:id="26" w:name="_Toc235289381"/>
       <w:r>
         <w:rPr>
           <w:rFonts w:ascii="Times New Roman" w:eastAsia="黑体" w:hAnsi="Times New Roman" w:cs="Times New Roman"/>
@@ -5163,12 +5248,11 @@
       <w:pPr>
         <w:pStyle w:val="21"/>
       </w:pPr>
-      <w:bookmarkStart w:id="28" w:name="_Toc235285784"/>
+      <w:bookmarkStart w:id="28" w:name="_Toc235289382"/>
       <w:r>
         <w:rPr>
           <w:rFonts w:ascii="Times New Roman" w:eastAsia="黑体" w:hAnsi="Times New Roman" w:cs="Times New Roman"/>
         </w:rPr>
-        <w:lastRenderedPageBreak/>
         <w:t xml:space="preserve">4.5 </w:t>
       </w:r>
       <w:r>
@@ -5424,12 +5508,11 @@
         <w:pStyle w:val="1"/>
         <w:pageBreakBefore/>
       </w:pPr>
-      <w:bookmarkStart w:id="30" w:name="_Toc235285785"/>
+      <w:bookmarkStart w:id="30" w:name="_Toc235289383"/>
       <w:r>
         <w:rPr>
           <w:rFonts w:ascii="Times New Roman" w:eastAsia="黑体" w:hAnsi="Times New Roman" w:cs="Times New Roman"/>
         </w:rPr>
-        <w:lastRenderedPageBreak/>
         <w:t xml:space="preserve">5 </w:t>
       </w:r>
       <w:r>
@@ -5480,12 +5563,11 @@
         <w:pStyle w:val="1"/>
         <w:pageBreakBefore/>
       </w:pPr>
-      <w:bookmarkStart w:id="31" w:name="_Toc235285786"/>
+      <w:bookmarkStart w:id="31" w:name="_Toc235289384"/>
       <w:r>
         <w:rPr>
           <w:rFonts w:ascii="Times New Roman" w:eastAsia="黑体" w:hAnsi="Times New Roman" w:cs="Times New Roman"/>
         </w:rPr>
-        <w:lastRenderedPageBreak/>
         <w:t>参考文献</w:t>
       </w:r>
       <w:bookmarkEnd w:id="31"/>
@@ -5672,12 +5754,11 @@
         <w:pStyle w:val="1"/>
         <w:pageBreakBefore/>
       </w:pPr>
-      <w:bookmarkStart w:id="35" w:name="_Toc235285787"/>
+      <w:bookmarkStart w:id="35" w:name="_Toc235289385"/>
       <w:r>
         <w:rPr>
           <w:rFonts w:ascii="Times New Roman" w:eastAsia="黑体" w:hAnsi="Times New Roman" w:cs="Times New Roman"/>
         </w:rPr>
-        <w:lastRenderedPageBreak/>
         <w:t>附录</w:t>
       </w:r>
       <w:r>
@@ -5690,89 +5771,113 @@
         <w:rPr>
           <w:rFonts w:ascii="Times New Roman" w:eastAsia="黑体" w:hAnsi="Times New Roman" w:cs="Times New Roman"/>
         </w:rPr>
-        <w:t>统一排版规则</w:t>
+        <w:t>交叉引用查看与更新</w:t>
       </w:r>
       <w:bookmarkEnd w:id="35"/>
     </w:p>
     <w:p>
       <w:pPr>
         <w:pStyle w:val="aff9"/>
-        <w:ind w:left="482" w:hanging="482"/>
-      </w:pPr>
-      <w:r>
-        <w:t xml:space="preserve">• </w:t>
-      </w:r>
-      <w:r>
-        <w:t>页面：</w:t>
-      </w:r>
-      <w:r>
-        <w:t>A4</w:t>
-      </w:r>
-      <w:r>
-        <w:t>；上边距</w:t>
-      </w:r>
-      <w:r>
-        <w:t>2.5 cm</w:t>
-      </w:r>
-      <w:r>
-        <w:t>，下</w:t>
-      </w:r>
-      <w:r>
-        <w:t>/</w:t>
-      </w:r>
-      <w:r>
-        <w:t>左</w:t>
-      </w:r>
-      <w:r>
-        <w:t>/</w:t>
-      </w:r>
-      <w:r>
-        <w:t>右边距</w:t>
-      </w:r>
-      <w:r>
-        <w:t>2.1 cm</w:t>
-      </w:r>
-      <w:r>
-        <w:t>；页眉、页脚距边界</w:t>
-      </w:r>
-      <w:r>
-        <w:t>1.5 cm</w:t>
-      </w:r>
-      <w:r>
-        <w:t>。</w:t>
+      </w:pPr>
+      <w:r>
+        <w:t>本页下划线编号均为真正的</w:t>
+      </w:r>
+      <w:r>
+        <w:t>Word REF</w:t>
+      </w:r>
+      <w:r>
+        <w:t>交叉引用域。默认情况下，它们与普通文字外观相同；按</w:t>
+      </w:r>
+      <w:r>
+        <w:t>Alt+F9</w:t>
+      </w:r>
+      <w:r>
+        <w:t>可在</w:t>
+      </w:r>
+      <w:r>
+        <w:t>“</w:t>
+      </w:r>
+      <w:r>
+        <w:t>引用结果</w:t>
+      </w:r>
+      <w:r>
+        <w:t>”</w:t>
+      </w:r>
+      <w:r>
+        <w:t>和</w:t>
+      </w:r>
+      <w:r>
+        <w:t>“</w:t>
+      </w:r>
+      <w:r>
+        <w:t>域代码</w:t>
+      </w:r>
+      <w:r>
+        <w:t>”</w:t>
+      </w:r>
+      <w:r>
+        <w:t>之间切换。</w:t>
       </w:r>
     </w:p>
     <w:p>
       <w:pPr>
         <w:pStyle w:val="aff9"/>
-        <w:ind w:left="482" w:hanging="482"/>
-      </w:pPr>
-      <w:r>
-        <w:t xml:space="preserve">• </w:t>
-      </w:r>
-      <w:r>
-        <w:t>正文：中文宋体小四（</w:t>
-      </w:r>
-      <w:r>
-        <w:t>12 pt</w:t>
-      </w:r>
-      <w:r>
-        <w:t>）；英文、数字和变量</w:t>
-      </w:r>
-      <w:r>
-        <w:t>Times New Roman</w:t>
-      </w:r>
-      <w:r>
-        <w:t>小四；固定</w:t>
-      </w:r>
-      <w:r>
-        <w:t>20 pt</w:t>
-      </w:r>
-      <w:r>
-        <w:t>；首行缩进约</w:t>
-      </w:r>
-      <w:r>
-        <w:t>0.85 cm</w:t>
+      </w:pPr>
+      <w:r>
+        <w:rPr>
+          <w:b/>
+        </w:rPr>
+        <w:t>图引用：</w:t>
+      </w:r>
+      <w:r>
+        <w:t>图</w:t>
+      </w:r>
+      <w:r>
+        <w:rPr>
+          <w:u w:val="single"/>
+        </w:rPr>
+        <w:fldChar w:fldCharType="begin"/>
+      </w:r>
+      <w:r>
+        <w:rPr>
+          <w:u w:val="single"/>
+        </w:rPr>
+        <w:instrText xml:space="preserve"> REF fig_2_1 \h </w:instrText>
+      </w:r>
+      <w:r>
+        <w:rPr>
+          <w:u w:val="single"/>
+        </w:rPr>
+      </w:r>
+      <w:r>
+        <w:rPr>
+          <w:u w:val="single"/>
+        </w:rPr>
+        <w:fldChar w:fldCharType="separate"/>
+      </w:r>
+      <w:r>
+        <w:rPr>
+          <w:sz w:val="21"/>
+        </w:rPr>
+        <w:t>2-</w:t>
+      </w:r>
+      <w:r>
+        <w:rPr>
+          <w:noProof/>
+        </w:rPr>
+        <w:t>1</w:t>
+      </w:r>
+      <w:r>
+        <w:rPr>
+          <w:u w:val="single"/>
+        </w:rPr>
+        <w:fldChar w:fldCharType="end"/>
+      </w:r>
+      <w:r>
+        <w:t>，域代码为</w:t>
+      </w:r>
+      <w:r>
+        <w:t xml:space="preserve"> REF fig_2_1 \h</w:t>
       </w:r>
       <w:r>
         <w:t>。</w:t>
@@ -5781,85 +5886,193 @@
     <w:p>
       <w:pPr>
         <w:pStyle w:val="aff9"/>
-        <w:ind w:left="482" w:hanging="482"/>
-      </w:pPr>
-      <w:r>
-        <w:t xml:space="preserve">• </w:t>
-      </w:r>
-      <w:r>
-        <w:t>标题：一级黑体</w:t>
-      </w:r>
-      <w:r>
-        <w:t>16 pt</w:t>
-      </w:r>
-      <w:r>
-        <w:t>居中；二级黑体</w:t>
-      </w:r>
-      <w:r>
-        <w:t>14 pt</w:t>
-      </w:r>
-      <w:r>
-        <w:t>左对齐；三级黑体</w:t>
-      </w:r>
-      <w:r>
-        <w:t>12 pt</w:t>
-      </w:r>
-      <w:r>
-        <w:t>左对齐。</w:t>
+      </w:pPr>
+      <w:r>
+        <w:rPr>
+          <w:b/>
+        </w:rPr>
+        <w:t>表引用：</w:t>
+      </w:r>
+      <w:r>
+        <w:t>表</w:t>
+      </w:r>
+      <w:r>
+        <w:rPr>
+          <w:u w:val="single"/>
+        </w:rPr>
+        <w:fldChar w:fldCharType="begin"/>
+      </w:r>
+      <w:r>
+        <w:rPr>
+          <w:u w:val="single"/>
+        </w:rPr>
+        <w:instrText xml:space="preserve"> REF tab_4_1 \h </w:instrText>
+      </w:r>
+      <w:r>
+        <w:rPr>
+          <w:u w:val="single"/>
+        </w:rPr>
+      </w:r>
+      <w:r>
+        <w:rPr>
+          <w:u w:val="single"/>
+        </w:rPr>
+        <w:fldChar w:fldCharType="separate"/>
+      </w:r>
+      <w:r>
+        <w:rPr>
+          <w:sz w:val="21"/>
+        </w:rPr>
+        <w:t>4-</w:t>
+      </w:r>
+      <w:r>
+        <w:rPr>
+          <w:noProof/>
+        </w:rPr>
+        <w:t>1</w:t>
+      </w:r>
+      <w:r>
+        <w:rPr>
+          <w:u w:val="single"/>
+        </w:rPr>
+        <w:fldChar w:fldCharType="end"/>
+      </w:r>
+      <w:r>
+        <w:t>，域代码为</w:t>
+      </w:r>
+      <w:r>
+        <w:t xml:space="preserve"> REF tab_4_1 \h</w:t>
+      </w:r>
+      <w:r>
+        <w:t>。</w:t>
       </w:r>
     </w:p>
     <w:p>
       <w:pPr>
         <w:pStyle w:val="aff9"/>
-        <w:ind w:left="482" w:hanging="482"/>
-      </w:pPr>
-      <w:r>
-        <w:t xml:space="preserve">• </w:t>
-      </w:r>
-      <w:r>
-        <w:t>图题</w:t>
-      </w:r>
-      <w:r>
-        <w:t>/</w:t>
-      </w:r>
-      <w:r>
-        <w:t>表题：中文宋体、英文</w:t>
-      </w:r>
-      <w:r>
-        <w:t>Times New Roman</w:t>
-      </w:r>
-      <w:r>
-        <w:t>五号（</w:t>
-      </w:r>
-      <w:r>
-        <w:t>10.5 pt</w:t>
-      </w:r>
-      <w:r>
-        <w:t>）；图题在图下，表题在表上。</w:t>
+      </w:pPr>
+      <w:r>
+        <w:rPr>
+          <w:b/>
+        </w:rPr>
+        <w:t>公式引用：</w:t>
+      </w:r>
+      <w:r>
+        <w:t>式（</w:t>
+      </w:r>
+      <w:r>
+        <w:rPr>
+          <w:u w:val="single"/>
+        </w:rPr>
+        <w:fldChar w:fldCharType="begin"/>
+      </w:r>
+      <w:r>
+        <w:rPr>
+          <w:u w:val="single"/>
+        </w:rPr>
+        <w:instrText xml:space="preserve"> REF eq_2_1 \h </w:instrText>
+      </w:r>
+      <w:r>
+        <w:rPr>
+          <w:u w:val="single"/>
+        </w:rPr>
+      </w:r>
+      <w:r>
+        <w:rPr>
+          <w:u w:val="single"/>
+        </w:rPr>
+        <w:fldChar w:fldCharType="separate"/>
+      </w:r>
+      <w:r>
+        <w:rPr>
+          <w:rFonts w:ascii="Cambria Math" w:hAnsi="Cambria Math" w:cs="Cambria Math"/>
+        </w:rPr>
+        <w:t>2-</w:t>
+      </w:r>
+      <w:r>
+        <w:rPr>
+          <w:noProof/>
+        </w:rPr>
+        <w:t>1</w:t>
+      </w:r>
+      <w:r>
+        <w:rPr>
+          <w:u w:val="single"/>
+        </w:rPr>
+        <w:fldChar w:fldCharType="end"/>
+      </w:r>
+      <w:r>
+        <w:t>），域代码为</w:t>
+      </w:r>
+      <w:r>
+        <w:t xml:space="preserve"> REF eq_2_1 \h</w:t>
+      </w:r>
+      <w:r>
+        <w:t>。</w:t>
       </w:r>
     </w:p>
     <w:p>
       <w:pPr>
         <w:pStyle w:val="aff9"/>
-        <w:ind w:left="482" w:hanging="482"/>
-      </w:pPr>
-      <w:r>
-        <w:t xml:space="preserve">• </w:t>
-      </w:r>
-      <w:r>
-        <w:t>图内坐标、刻度与图例：中文宋体、英文</w:t>
-      </w:r>
-      <w:r>
-        <w:t>Times New Roman</w:t>
-      </w:r>
-      <w:r>
-        <w:t>，</w:t>
-      </w:r>
-      <w:r>
-        <w:t>9–10.5 pt</w:t>
-      </w:r>
-      <w:r>
-        <w:t>；同一篇报告保持一致。</w:t>
+      </w:pPr>
+      <w:r>
+        <w:rPr>
+          <w:b/>
+        </w:rPr>
+        <w:t>文献引用：</w:t>
+      </w:r>
+      <w:r>
+        <w:t>文献</w:t>
+      </w:r>
+      <w:r>
+        <w:rPr>
+          <w:u w:val="single"/>
+        </w:rPr>
+        <w:fldChar w:fldCharType="begin"/>
+      </w:r>
+      <w:r>
+        <w:rPr>
+          <w:u w:val="single"/>
+        </w:rPr>
+        <w:instrText xml:space="preserve"> REF ref_1 \h </w:instrText>
+      </w:r>
+      <w:r>
+        <w:rPr>
+          <w:u w:val="single"/>
+        </w:rPr>
+      </w:r>
+      <w:r>
+        <w:rPr>
+          <w:u w:val="single"/>
+        </w:rPr>
+        <w:fldChar w:fldCharType="separate"/>
+      </w:r>
+      <w:r>
+        <w:t>[</w:t>
+      </w:r>
+      <w:r>
+        <w:rPr>
+          <w:noProof/>
+        </w:rPr>
+        <w:t>1</w:t>
+      </w:r>
+      <w:r>
+        <w:t>]</w:t>
+      </w:r>
+      <w:r>
+        <w:rPr>
+          <w:u w:val="single"/>
+        </w:rPr>
+        <w:fldChar w:fldCharType="end"/>
+      </w:r>
+      <w:r>
+        <w:t>，域代码为</w:t>
+      </w:r>
+      <w:r>
+        <w:t xml:space="preserve"> REF ref_1 \h</w:t>
+      </w:r>
+      <w:r>
+        <w:t>。</w:t>
       </w:r>
     </w:p>
     <w:p>
@@ -5871,7 +6084,19 @@
         <w:t xml:space="preserve">• </w:t>
       </w:r>
       <w:r>
-        <w:t>表格：优先三线表；单位写在表头；参数值与单位分列；表后说明数据来源。</w:t>
+        <w:t>检查域代码：按</w:t>
+      </w:r>
+      <w:r>
+        <w:t>Alt+F9</w:t>
+      </w:r>
+      <w:r>
+        <w:t>；再次按</w:t>
+      </w:r>
+      <w:r>
+        <w:t>Alt+F9</w:t>
+      </w:r>
+      <w:r>
+        <w:t>返回正常显示。</w:t>
       </w:r>
     </w:p>
     <w:p>
@@ -5883,7 +6108,19 @@
         <w:t xml:space="preserve">• </w:t>
       </w:r>
       <w:r>
-        <w:t>图后解释：固定包含坐标与对象、计算依据、主要趋势、方法对比、结论与价值、适用边界。</w:t>
+        <w:t>更新单个引用：右键单击编号，选择</w:t>
+      </w:r>
+      <w:r>
+        <w:t>“</w:t>
+      </w:r>
+      <w:r>
+        <w:t>更新域</w:t>
+      </w:r>
+      <w:r>
+        <w:t>”</w:t>
+      </w:r>
+      <w:r>
+        <w:t>。</w:t>
       </w:r>
     </w:p>
     <w:p>
@@ -5895,31 +6132,19 @@
         <w:t xml:space="preserve">• </w:t>
       </w:r>
       <w:r>
-        <w:t>编号：图、表和公式均按章编号，如图</w:t>
-      </w:r>
-      <w:r>
-        <w:t>2-1</w:t>
-      </w:r>
-      <w:r>
-        <w:t>、表</w:t>
-      </w:r>
-      <w:r>
-        <w:t>4-1</w:t>
-      </w:r>
-      <w:r>
-        <w:t>、式（</w:t>
-      </w:r>
-      <w:r>
-        <w:t>2-1</w:t>
-      </w:r>
-      <w:r>
-        <w:t>）；正文必须使用</w:t>
-      </w:r>
-      <w:r>
-        <w:t>Word</w:t>
-      </w:r>
-      <w:r>
-        <w:t>交叉引用，不得手工输入编号。</w:t>
+        <w:t>更新全文：按</w:t>
+      </w:r>
+      <w:r>
+        <w:t>Ctrl+A</w:t>
+      </w:r>
+      <w:r>
+        <w:t>全选，再按</w:t>
+      </w:r>
+      <w:r>
+        <w:t>F9</w:t>
+      </w:r>
+      <w:r>
+        <w:t>。</w:t>
       </w:r>
     </w:p>
     <w:p>
@@ -5931,98 +6156,37 @@
         <w:t xml:space="preserve">• </w:t>
       </w:r>
       <w:r>
-        <w:t>文献：参考文献序号采用自动编号并设置书签；正文引用采用</w:t>
-      </w:r>
-      <w:r>
-        <w:t>REF</w:t>
-      </w:r>
-      <w:r>
-        <w:t>交叉引用，例如文献</w:t>
-      </w:r>
-      <w:r>
-        <w:t>[1]</w:t>
-      </w:r>
-      <w:r>
-        <w:t>。</w:t>
+        <w:t>插入新引用：使用</w:t>
+      </w:r>
+      <w:r>
+        <w:t>“</w:t>
+      </w:r>
+      <w:r>
+        <w:t>引用</w:t>
+      </w:r>
+      <w:r>
+        <w:t>→</w:t>
+      </w:r>
+      <w:r>
+        <w:t>交叉引用</w:t>
+      </w:r>
+      <w:r>
+        <w:t>”</w:t>
+      </w:r>
+      <w:r>
+        <w:t>，不要复制或手工输入旧编号。</w:t>
       </w:r>
     </w:p>
     <w:p>
       <w:pPr>
-        <w:pStyle w:val="aff9"/>
-        <w:ind w:left="482" w:hanging="482"/>
-      </w:pPr>
-      <w:r>
-        <w:t xml:space="preserve">• </w:t>
-      </w:r>
-      <w:r>
-        <w:t>更新：提交或导出前按</w:t>
-      </w:r>
-      <w:r>
-        <w:t>Ctrl+A</w:t>
-      </w:r>
-      <w:r>
-        <w:t>全选，再按</w:t>
-      </w:r>
-      <w:r>
-        <w:t>F9</w:t>
-      </w:r>
-      <w:r>
-        <w:t>更新目录、题注、公式编号和全部交叉引用。</w:t>
-      </w:r>
-    </w:p>
-    <w:p>
-      <w:pPr>
-        <w:pStyle w:val="aff9"/>
-        <w:ind w:left="482" w:hanging="482"/>
-      </w:pPr>
-      <w:r>
-        <w:t xml:space="preserve">• </w:t>
-      </w:r>
-      <w:r>
-        <w:t>重要：</w:t>
-      </w:r>
-      <w:r>
-        <w:t>Word</w:t>
-      </w:r>
-      <w:r>
-        <w:t>只能统一图题，不能修改已经嵌入</w:t>
-      </w:r>
-      <w:r>
-        <w:t>PNG/PDF</w:t>
-      </w:r>
-      <w:r>
-        <w:t>图中的图例字体；图内字体必须在</w:t>
-      </w:r>
-      <w:r>
-        <w:t>MATLAB</w:t>
-      </w:r>
-      <w:r>
-        <w:t>导出前设置。</w:t>
-      </w:r>
-    </w:p>
-    <w:p>
-      <w:pPr>
-        <w:pStyle w:val="aff9"/>
-        <w:ind w:left="482" w:hanging="482"/>
-      </w:pPr>
-      <w:r>
-        <w:t xml:space="preserve">• </w:t>
-      </w:r>
-      <w:r>
-        <w:t>优先级：若学校、会议或期刊发布正式模板，则目标单位模板高于本通用模板。</w:t>
-      </w:r>
-    </w:p>
-    <w:p>
-      <w:pPr>
         <w:pStyle w:val="1"/>
         <w:pageBreakBefore/>
       </w:pPr>
-      <w:bookmarkStart w:id="36" w:name="_Toc235285788"/>
+      <w:bookmarkStart w:id="36" w:name="_Toc235289386"/>
       <w:r>
         <w:rPr>
           <w:rFonts w:ascii="Times New Roman" w:eastAsia="黑体" w:hAnsi="Times New Roman" w:cs="Times New Roman"/>
         </w:rPr>
-        <w:lastRenderedPageBreak/>
         <w:t>附录</w:t>
       </w:r>
       <w:r>
@@ -6035,9 +6199,353 @@
         <w:rPr>
           <w:rFonts w:ascii="Times New Roman" w:eastAsia="黑体" w:hAnsi="Times New Roman" w:cs="Times New Roman"/>
         </w:rPr>
+        <w:t>统一排版规则</w:t>
+      </w:r>
+      <w:bookmarkEnd w:id="36"/>
+    </w:p>
+    <w:p>
+      <w:pPr>
+        <w:pStyle w:val="aff9"/>
+        <w:ind w:left="482" w:hanging="482"/>
+      </w:pPr>
+      <w:r>
+        <w:t xml:space="preserve">• </w:t>
+      </w:r>
+      <w:r>
+        <w:t>页面：</w:t>
+      </w:r>
+      <w:r>
+        <w:t>A4</w:t>
+      </w:r>
+      <w:r>
+        <w:t>；上边距</w:t>
+      </w:r>
+      <w:r>
+        <w:t>2.5 cm</w:t>
+      </w:r>
+      <w:r>
+        <w:t>，下</w:t>
+      </w:r>
+      <w:r>
+        <w:t>/</w:t>
+      </w:r>
+      <w:r>
+        <w:t>左</w:t>
+      </w:r>
+      <w:r>
+        <w:t>/</w:t>
+      </w:r>
+      <w:r>
+        <w:t>右边距</w:t>
+      </w:r>
+      <w:r>
+        <w:t>2.1 cm</w:t>
+      </w:r>
+      <w:r>
+        <w:t>；页眉、页脚距边界</w:t>
+      </w:r>
+      <w:r>
+        <w:t>1.5 cm</w:t>
+      </w:r>
+      <w:r>
+        <w:t>。</w:t>
+      </w:r>
+    </w:p>
+    <w:p>
+      <w:pPr>
+        <w:pStyle w:val="aff9"/>
+        <w:ind w:left="482" w:hanging="482"/>
+      </w:pPr>
+      <w:r>
+        <w:t xml:space="preserve">• </w:t>
+      </w:r>
+      <w:r>
+        <w:t>正文：中文宋体小四（</w:t>
+      </w:r>
+      <w:r>
+        <w:t>12 pt</w:t>
+      </w:r>
+      <w:r>
+        <w:t>）；英文、数字和变量</w:t>
+      </w:r>
+      <w:r>
+        <w:t>Times New Roman</w:t>
+      </w:r>
+      <w:r>
+        <w:t>小四；固定</w:t>
+      </w:r>
+      <w:r>
+        <w:t>20 pt</w:t>
+      </w:r>
+      <w:r>
+        <w:t>；首行缩进约</w:t>
+      </w:r>
+      <w:r>
+        <w:t>0.85 cm</w:t>
+      </w:r>
+      <w:r>
+        <w:t>。</w:t>
+      </w:r>
+    </w:p>
+    <w:p>
+      <w:pPr>
+        <w:pStyle w:val="aff9"/>
+        <w:ind w:left="482" w:hanging="482"/>
+      </w:pPr>
+      <w:r>
+        <w:t xml:space="preserve">• </w:t>
+      </w:r>
+      <w:r>
+        <w:t>标题：一级黑体</w:t>
+      </w:r>
+      <w:r>
+        <w:t>16 pt</w:t>
+      </w:r>
+      <w:r>
+        <w:t>居中；二级黑体</w:t>
+      </w:r>
+      <w:r>
+        <w:t>14 pt</w:t>
+      </w:r>
+      <w:r>
+        <w:t>左对齐；三级黑体</w:t>
+      </w:r>
+      <w:r>
+        <w:t>12 pt</w:t>
+      </w:r>
+      <w:r>
+        <w:t>左对齐。</w:t>
+      </w:r>
+    </w:p>
+    <w:p>
+      <w:pPr>
+        <w:pStyle w:val="aff9"/>
+        <w:ind w:left="482" w:hanging="482"/>
+      </w:pPr>
+      <w:r>
+        <w:t xml:space="preserve">• </w:t>
+      </w:r>
+      <w:r>
+        <w:t>图题</w:t>
+      </w:r>
+      <w:r>
+        <w:t>/</w:t>
+      </w:r>
+      <w:r>
+        <w:t>表题：中文宋体、英文</w:t>
+      </w:r>
+      <w:r>
+        <w:t>Times New Roman</w:t>
+      </w:r>
+      <w:r>
+        <w:t>五号（</w:t>
+      </w:r>
+      <w:r>
+        <w:t>10.5 pt</w:t>
+      </w:r>
+      <w:r>
+        <w:t>）；图题在图下，表题在表上。</w:t>
+      </w:r>
+    </w:p>
+    <w:p>
+      <w:pPr>
+        <w:pStyle w:val="aff9"/>
+        <w:ind w:left="482" w:hanging="482"/>
+      </w:pPr>
+      <w:r>
+        <w:t xml:space="preserve">• </w:t>
+      </w:r>
+      <w:r>
+        <w:t>图内坐标、刻度与图例：中文宋体、英文</w:t>
+      </w:r>
+      <w:r>
+        <w:t>Times New Roman</w:t>
+      </w:r>
+      <w:r>
+        <w:t>，</w:t>
+      </w:r>
+      <w:r>
+        <w:t>9–10.5 pt</w:t>
+      </w:r>
+      <w:r>
+        <w:t>；同一篇报告保持一致。</w:t>
+      </w:r>
+    </w:p>
+    <w:p>
+      <w:pPr>
+        <w:pStyle w:val="aff9"/>
+        <w:ind w:left="482" w:hanging="482"/>
+      </w:pPr>
+      <w:r>
+        <w:t xml:space="preserve">• </w:t>
+      </w:r>
+      <w:r>
+        <w:t>表格：优先三线表；单位写在表头；参数值与单位分列；表后说明数据来源。</w:t>
+      </w:r>
+    </w:p>
+    <w:p>
+      <w:pPr>
+        <w:pStyle w:val="aff9"/>
+        <w:ind w:left="482" w:hanging="482"/>
+      </w:pPr>
+      <w:r>
+        <w:t xml:space="preserve">• </w:t>
+      </w:r>
+      <w:r>
+        <w:t>图后解释：固定包含坐标与对象、计算依据、主要趋势、方法对比、结论与价值、适用边界。</w:t>
+      </w:r>
+    </w:p>
+    <w:p>
+      <w:pPr>
+        <w:pStyle w:val="aff9"/>
+        <w:ind w:left="482" w:hanging="482"/>
+      </w:pPr>
+      <w:r>
+        <w:t xml:space="preserve">• </w:t>
+      </w:r>
+      <w:r>
+        <w:t>编号：图、表和公式均按章编号，如图</w:t>
+      </w:r>
+      <w:r>
+        <w:t>2-1</w:t>
+      </w:r>
+      <w:r>
+        <w:t>、表</w:t>
+      </w:r>
+      <w:r>
+        <w:t>4-1</w:t>
+      </w:r>
+      <w:r>
+        <w:t>、式（</w:t>
+      </w:r>
+      <w:r>
+        <w:t>2-1</w:t>
+      </w:r>
+      <w:r>
+        <w:t>）；正文必须使用</w:t>
+      </w:r>
+      <w:r>
+        <w:t>Word</w:t>
+      </w:r>
+      <w:r>
+        <w:t>交叉引用，不得手工输入编号。</w:t>
+      </w:r>
+    </w:p>
+    <w:p>
+      <w:pPr>
+        <w:pStyle w:val="aff9"/>
+        <w:ind w:left="482" w:hanging="482"/>
+      </w:pPr>
+      <w:r>
+        <w:t xml:space="preserve">• </w:t>
+      </w:r>
+      <w:r>
+        <w:t>文献：参考文献序号采用自动编号并设置书签；正文引用采用</w:t>
+      </w:r>
+      <w:r>
+        <w:t>REF</w:t>
+      </w:r>
+      <w:r>
+        <w:t>交叉引用，例如文献</w:t>
+      </w:r>
+      <w:r>
+        <w:t>[1]</w:t>
+      </w:r>
+      <w:r>
+        <w:t>。</w:t>
+      </w:r>
+    </w:p>
+    <w:p>
+      <w:pPr>
+        <w:pStyle w:val="aff9"/>
+        <w:ind w:left="482" w:hanging="482"/>
+      </w:pPr>
+      <w:r>
+        <w:t xml:space="preserve">• </w:t>
+      </w:r>
+      <w:r>
+        <w:t>更新：提交或导出前按</w:t>
+      </w:r>
+      <w:r>
+        <w:t>Ctrl+A</w:t>
+      </w:r>
+      <w:r>
+        <w:t>全选，再按</w:t>
+      </w:r>
+      <w:r>
+        <w:t>F9</w:t>
+      </w:r>
+      <w:r>
+        <w:t>更新目录、题注、公式编号和全部交叉引用。</w:t>
+      </w:r>
+    </w:p>
+    <w:p>
+      <w:pPr>
+        <w:pStyle w:val="aff9"/>
+        <w:ind w:left="482" w:hanging="482"/>
+      </w:pPr>
+      <w:r>
+        <w:t xml:space="preserve">• </w:t>
+      </w:r>
+      <w:r>
+        <w:t>重要：</w:t>
+      </w:r>
+      <w:r>
+        <w:t>Word</w:t>
+      </w:r>
+      <w:r>
+        <w:t>只能统一图题，不能修改已经嵌入</w:t>
+      </w:r>
+      <w:r>
+        <w:t>PNG/PDF</w:t>
+      </w:r>
+      <w:r>
+        <w:t>图中的图例字体；图内字体必须在</w:t>
+      </w:r>
+      <w:r>
+        <w:t>MATLAB</w:t>
+      </w:r>
+      <w:r>
+        <w:t>导出前设置。</w:t>
+      </w:r>
+    </w:p>
+    <w:p>
+      <w:pPr>
+        <w:pStyle w:val="aff9"/>
+        <w:ind w:left="482" w:hanging="482"/>
+      </w:pPr>
+      <w:r>
+        <w:t xml:space="preserve">• </w:t>
+      </w:r>
+      <w:r>
+        <w:t>优先级：若学校、会议或期刊发布正式模板，则目标单位模板高于本通用模板。</w:t>
+      </w:r>
+    </w:p>
+    <w:p>
+      <w:pPr>
+        <w:pStyle w:val="1"/>
+        <w:pageBreakBefore/>
+      </w:pPr>
+      <w:bookmarkStart w:id="37" w:name="_Toc235289387"/>
+      <w:r>
+        <w:rPr>
+          <w:rFonts w:ascii="Times New Roman" w:eastAsia="黑体" w:hAnsi="Times New Roman" w:cs="Times New Roman"/>
+        </w:rPr>
+        <w:t>附录</w:t>
+      </w:r>
+      <w:r>
+        <w:rPr>
+          <w:rFonts w:ascii="Times New Roman" w:eastAsia="黑体" w:hAnsi="Times New Roman" w:cs="Times New Roman"/>
+        </w:rPr>
+        <w:t xml:space="preserve">C </w:t>
+      </w:r>
+      <w:r>
+        <w:rPr>
+          <w:rFonts w:ascii="Times New Roman" w:eastAsia="黑体" w:hAnsi="Times New Roman" w:cs="Times New Roman"/>
+        </w:rPr>
         <w:t>规范依据</w:t>
       </w:r>
-      <w:bookmarkEnd w:id="36"/>
+      <w:bookmarkEnd w:id="37"/>
     </w:p>
     <w:p>
       <w:pPr>
@@ -6485,31 +6993,31 @@
       </w:rPr>
     </w:lvl>
   </w:abstractNum>
-  <w:num w:numId="1" w16cid:durableId="904804929">
+  <w:num w:numId="1" w16cid:durableId="493766038">
     <w:abstractNumId w:val="8"/>
   </w:num>
-  <w:num w:numId="2" w16cid:durableId="932204271">
+  <w:num w:numId="2" w16cid:durableId="1280722826">
     <w:abstractNumId w:val="6"/>
   </w:num>
-  <w:num w:numId="3" w16cid:durableId="1472482583">
+  <w:num w:numId="3" w16cid:durableId="1503623738">
     <w:abstractNumId w:val="5"/>
   </w:num>
-  <w:num w:numId="4" w16cid:durableId="38821166">
+  <w:num w:numId="4" w16cid:durableId="1889566598">
     <w:abstractNumId w:val="4"/>
   </w:num>
-  <w:num w:numId="5" w16cid:durableId="420566036">
+  <w:num w:numId="5" w16cid:durableId="456333579">
     <w:abstractNumId w:val="7"/>
   </w:num>
-  <w:num w:numId="6" w16cid:durableId="1965770286">
+  <w:num w:numId="6" w16cid:durableId="1456409302">
     <w:abstractNumId w:val="3"/>
   </w:num>
-  <w:num w:numId="7" w16cid:durableId="2121603028">
+  <w:num w:numId="7" w16cid:durableId="993413769">
     <w:abstractNumId w:val="2"/>
   </w:num>
-  <w:num w:numId="8" w16cid:durableId="1421759440">
+  <w:num w:numId="8" w16cid:durableId="988705247">
     <w:abstractNumId w:val="1"/>
   </w:num>
-  <w:num w:numId="9" w16cid:durableId="1520462690">
+  <w:num w:numId="9" w16cid:durableId="2109619127">
     <w:abstractNumId w:val="0"/>
   </w:num>
 </w:numbering>
@@ -17993,7 +18501,7 @@
     <w:autoRedefine/>
     <w:uiPriority w:val="39"/>
     <w:unhideWhenUsed/>
-    <w:rsid w:val="00D97934"/>
+    <w:rsid w:val="004A08AE"/>
   </w:style>
   <w:style w:type="paragraph" w:styleId="TOC2">
     <w:name w:val="toc 2"/>
@@ -18002,7 +18510,7 @@
     <w:autoRedefine/>
     <w:uiPriority w:val="39"/>
     <w:unhideWhenUsed/>
-    <w:rsid w:val="00D97934"/>
+    <w:rsid w:val="004A08AE"/>
     <w:pPr>
       <w:ind w:leftChars="200" w:left="420"/>
     </w:pPr>
@@ -18012,7 +18520,7 @@
     <w:basedOn w:val="a2"/>
     <w:uiPriority w:val="99"/>
     <w:unhideWhenUsed/>
-    <w:rsid w:val="00D97934"/>
+    <w:rsid w:val="004A08AE"/>
     <w:rPr>
       <w:color w:val="0000FF" w:themeColor="hyperlink"/>
       <w:u w:val="single"/>

</xml_diff>